<commit_message>
Anonymize participating school in paper copy
</commit_message>
<xml_diff>
--- a/paper/开封旅游双驱动研究-匿名版.docx
+++ b/paper/开封旅游双驱动研究-匿名版.docx
@@ -444,7 +444,7 @@
                 <w:sz w:val="35"/>
                 <w:szCs w:val="35"/>
               </w:rPr>
-              <w:t>郑州西亚斯学院</w:t>
+              <w:t>（已隐去）</w:t>
             </w:r>
           </w:p>
         </w:tc>
@@ -24387,7 +24387,7 @@
         <w:rPr>
           <w:rFonts w:hint="eastAsia"/>
         </w:rPr>
-        <w:t>此外，感谢郑州西亚斯学院为我们提供的学习环境和资源支持。学校完善的科研设施和丰富的学术资源为我们的研究提供了有力保障。在研究中，我们互相学习、分工协作，克服了数据收集、模型调试和论文修改中的种种困难，最终圆满完成了任务。这段并肩奋斗的经历将成为我们大学生活中难忘的回忆。</w:t>
+        <w:t>此外，感谢学校为我们提供的学习环境和资源支持。学校完善的科研设施和丰富的学术资源为我们的研究提供了有力保障。在研究中，我们互相学习、分工协作，克服了数据收集、模型调试和论文修改中的种种困难，最终圆满完成了任务。这段并肩奋斗的经历将成为我们大学生活中难忘的回忆。</w:t>
       </w:r>
     </w:p>
     <w:p>

</xml_diff>